<commit_message>
Add consolidated Additional_File_1_Supplementary_Appendix.docx and update Additional files section
</commit_message>
<xml_diff>
--- a/manuscript/BLL_manuscript_Draft_Updated_24_10_26.docx
+++ b/manuscript/BLL_manuscript_Draft_Updated_24_10_26.docx
@@ -25118,10 +25118,9 @@
       </w:pPr>
       <w:r>
         <w:rPr>
-          <w:rFonts w:cs="Times New Roman"/>
           <w:b/>
         </w:rPr>
-        <w:t>Supplementary Material</w:t>
+        <w:t>Additional files</w:t>
       </w:r>
     </w:p>
     <w:p>
@@ -25131,24 +25130,11 @@
         </w:rPr>
       </w:pPr>
       <w:r>
-        <w:rPr>
-          <w:rFonts w:cs="Times New Roman"/>
-          <w:b/>
-          <w:bCs/>
-        </w:rPr>
-        <w:t>Supplementary Figure S1:</w:t>
-      </w:r>
-      <w:r>
-        <w:rPr>
-          <w:rFonts w:cs="Times New Roman"/>
-        </w:rPr>
-        <w:t xml:space="preserve"> </w:t>
-      </w:r>
-      <w:r>
-        <w:rPr>
-          <w:rFonts w:cs="Times New Roman"/>
-        </w:rPr>
-        <w:t>STROBE participant selection flow diagram</w:t>
+        <w:t>Additional file 1: Supplementary Appendix (.docx)</w:t>
+        <w:br/>
+        <w:t>Title of data: Supplementary Figures S1–S3 and Supplementary Tables S1–S4.</w:t>
+        <w:br/>
+        <w:t>Description of data: Contains the STROBE cohort derivation flowchart (Figure S1), Conceptual Directed Acyclic Graph (Figure S2), restricted cubic splines (Figure S3), crude vs adjusted linear models (Table S1), survey-weighted multivariable logistic regression sensitivity analysis (Table S2), E. coli water quality testing subsample sensitivity analysis (Table S3), and multicollinearity VIF diagnostic statistics (Table S4).</w:t>
       </w:r>
     </w:p>
     <w:p>
@@ -25157,28 +25143,7 @@
           <w:rFonts w:cs="Times New Roman"/>
         </w:rPr>
       </w:pPr>
-      <w:r>
-        <w:rPr>
-          <w:rFonts w:cs="Times New Roman"/>
-          <w:b/>
-          <w:bCs/>
-        </w:rPr>
-        <w:t>Supplementary Figure S2</w:t>
-      </w:r>
-      <w:r>
-        <w:rPr>
-          <w:rFonts w:cs="Times New Roman"/>
-          <w:b/>
-          <w:bCs/>
-        </w:rPr>
-        <w:t>:</w:t>
-      </w:r>
-      <w:r>
-        <w:rPr>
-          <w:rFonts w:cs="Times New Roman"/>
-        </w:rPr>
-        <w:t xml:space="preserve"> The Conceptual DAG diagram </w:t>
-      </w:r>
+      <w:r/>
     </w:p>
     <w:p>
       <w:pPr>
@@ -25186,28 +25151,7 @@
           <w:rFonts w:cs="Times New Roman"/>
         </w:rPr>
       </w:pPr>
-      <w:r>
-        <w:rPr>
-          <w:rFonts w:cs="Times New Roman"/>
-          <w:b/>
-          <w:bCs/>
-        </w:rPr>
-        <w:t>Supplementary Figure S3</w:t>
-      </w:r>
-      <w:r>
-        <w:rPr>
-          <w:rFonts w:cs="Times New Roman"/>
-          <w:b/>
-          <w:bCs/>
-        </w:rPr>
-        <w:t>:</w:t>
-      </w:r>
-      <w:r>
-        <w:rPr>
-          <w:rFonts w:cs="Times New Roman"/>
-        </w:rPr>
-        <w:t xml:space="preserve"> The blue Splines curve diagram </w:t>
-      </w:r>
+      <w:r/>
     </w:p>
     <w:p>
       <w:pPr>
@@ -25215,20 +25159,7 @@
           <w:rFonts w:cs="Times New Roman"/>
         </w:rPr>
       </w:pPr>
-      <w:r>
-        <w:rPr>
-          <w:rFonts w:cs="Times New Roman"/>
-          <w:b/>
-          <w:bCs/>
-        </w:rPr>
-        <w:t>Supplementary Table S1:</w:t>
-      </w:r>
-      <w:r>
-        <w:rPr>
-          <w:rFonts w:cs="Times New Roman"/>
-        </w:rPr>
-        <w:t xml:space="preserve"> Crude vs Adjusted Models </w:t>
-      </w:r>
+      <w:r/>
     </w:p>
     <w:p>
       <w:pPr>
@@ -25236,20 +25167,7 @@
           <w:rFonts w:cs="Times New Roman"/>
         </w:rPr>
       </w:pPr>
-      <w:r>
-        <w:rPr>
-          <w:rFonts w:cs="Times New Roman"/>
-          <w:b/>
-          <w:bCs/>
-        </w:rPr>
-        <w:t>Supplementary Table S2:</w:t>
-      </w:r>
-      <w:r>
-        <w:rPr>
-          <w:rFonts w:cs="Times New Roman"/>
-        </w:rPr>
-        <w:t xml:space="preserve"> Logistic Regression (aOR) Check </w:t>
-      </w:r>
+      <w:r/>
     </w:p>
     <w:p>
       <w:pPr>
@@ -25257,20 +25175,7 @@
           <w:rFonts w:cs="Times New Roman"/>
         </w:rPr>
       </w:pPr>
-      <w:r>
-        <w:rPr>
-          <w:rFonts w:cs="Times New Roman"/>
-          <w:b/>
-          <w:bCs/>
-        </w:rPr>
-        <w:t>Supplementary Table S3:</w:t>
-      </w:r>
-      <w:r>
-        <w:rPr>
-          <w:rFonts w:cs="Times New Roman"/>
-        </w:rPr>
-        <w:t xml:space="preserve"> E. coli Water Quality Subsample </w:t>
-      </w:r>
+      <w:r/>
     </w:p>
     <w:p>
       <w:pPr>
@@ -25278,20 +25183,7 @@
           <w:rFonts w:cs="Times New Roman"/>
         </w:rPr>
       </w:pPr>
-      <w:r>
-        <w:rPr>
-          <w:rFonts w:cs="Times New Roman"/>
-          <w:b/>
-          <w:bCs/>
-        </w:rPr>
-        <w:t>Supplementary Table S4:</w:t>
-      </w:r>
-      <w:r>
-        <w:rPr>
-          <w:rFonts w:cs="Times New Roman"/>
-        </w:rPr>
-        <w:t xml:space="preserve"> Collinearity / VIF Diagnostics</w:t>
-      </w:r>
+      <w:r/>
     </w:p>
     <w:p>
       <w:pPr>

</xml_diff>